<commit_message>
Revise report to 5 pages; simplify AI appendix to match notebook format
</commit_message>
<xml_diff>
--- a/ECON3916_AI_Appendix.docx
+++ b/ECON3916_AI_Appendix.docx
@@ -4,253 +4,259 @@
   <w:body>
     <w:p>
       <w:pPr>
-        <w:spacing w:before="800"/>
+        <w:spacing w:before="400" w:after="120"/>
         <w:jc w:val="center"/>
       </w:pPr>
       <w:r>
         <w:rPr>
-          <w:color w:val="666666"/>
-          <w:sz w:val="26"/>
+          <w:rFonts w:ascii="Calibri" w:hAnsi="Calibri"/>
+          <w:b/>
+          <w:color w:val="222222"/>
+          <w:sz w:val="36"/>
         </w:rPr>
-        <w:t>ECON 3916 — Final Project</w:t>
+        <w:t>Part 7: AI Methodology Appendix</w:t>
       </w:r>
     </w:p>
     <w:p>
       <w:pPr>
+        <w:spacing w:after="80"/>
         <w:jc w:val="center"/>
       </w:pPr>
       <w:r>
         <w:rPr>
-          <w:b/>
-          <w:color w:val="E50914"/>
-          <w:sz w:val="44"/>
+          <w:rFonts w:ascii="Calibri" w:hAnsi="Calibri"/>
+          <w:color w:val="666666"/>
+          <w:sz w:val="22"/>
         </w:rPr>
-        <w:t>AI Methodology Appendix</w:t>
+        <w:t>ECON 3916 Final Project  |  zzzzzssyy  |  April 2026</w:t>
       </w:r>
     </w:p>
     <w:p>
       <w:pPr>
+        <w:spacing w:after="200"/>
         <w:jc w:val="center"/>
       </w:pPr>
       <w:r>
         <w:rPr>
+          <w:rFonts w:ascii="Calibri" w:hAnsi="Calibri"/>
           <w:i/>
-          <w:sz w:val="26"/>
+          <w:sz w:val="21"/>
         </w:rPr>
-        <w:t>P.R.I.M.E. Framework — Documented AI Interactions</w:t>
-      </w:r>
-    </w:p>
-    <w:p/>
-    <w:p>
-      <w:pPr>
-        <w:jc w:val="center"/>
-      </w:pPr>
-      <w:r>
-        <w:rPr>
-          <w:color w:val="555555"/>
-          <w:sz w:val="22"/>
-        </w:rPr>
-        <w:t>Student: zzzzzssyy   |   Course: ECON 3916-33674   |   April 2026</w:t>
-      </w:r>
-    </w:p>
-    <w:p>
-      <w:r>
-        <w:br w:type="page"/>
+        <w:t>Document at least 3 AI interactions using the P.R.I.M.E. framework.</w:t>
       </w:r>
     </w:p>
     <w:p>
       <w:pPr>
-        <w:pStyle w:val="Heading1"/>
-        <w:spacing w:before="240" w:after="80"/>
-      </w:pPr>
-      <w:r>
-        <w:rPr>
-          <w:b/>
-          <w:color w:val="E50914"/>
-          <w:sz w:val="32"/>
-        </w:rPr>
-        <w:t>Overview</w:t>
-      </w:r>
-    </w:p>
-    <w:p>
-      <w:pPr>
-        <w:spacing w:after="120" w:line="320" w:lineRule="exact"/>
-      </w:pPr>
-      <w:r>
-        <w:rPr>
-          <w:rFonts w:ascii="Calibri" w:hAnsi="Calibri"/>
-          <w:sz w:val="22"/>
-        </w:rPr>
-        <w:t>This appendix documents three AI-assisted interactions during the development of the Netflix Watch Time Prediction project. Each interaction is recorded using the P.R.I.M.E. framework:</w:t>
-      </w:r>
-    </w:p>
-    <w:p>
-      <w:pPr>
-        <w:pStyle w:val="ListBullet"/>
-        <w:spacing w:after="80"/>
-      </w:pPr>
-      <w:r>
-        <w:rPr>
-          <w:b/>
-          <w:sz w:val="22"/>
-        </w:rPr>
-        <w:t xml:space="preserve">P — Prep:  </w:t>
-      </w:r>
-      <w:r>
-        <w:rPr>
-          <w:sz w:val="22"/>
-        </w:rPr>
-        <w:t>What context and prior knowledge did I have before prompting?</w:t>
-      </w:r>
-    </w:p>
-    <w:p>
-      <w:pPr>
-        <w:pStyle w:val="ListBullet"/>
-        <w:spacing w:after="80"/>
-      </w:pPr>
-      <w:r>
-        <w:rPr>
-          <w:b/>
-          <w:sz w:val="22"/>
-        </w:rPr>
-        <w:t xml:space="preserve">R — Request:  </w:t>
-      </w:r>
-      <w:r>
-        <w:rPr>
-          <w:sz w:val="22"/>
-        </w:rPr>
-        <w:t>The exact prompt submitted to the AI co-pilot.</w:t>
-      </w:r>
-    </w:p>
-    <w:p>
-      <w:pPr>
-        <w:pStyle w:val="ListBullet"/>
-        <w:spacing w:after="80"/>
-      </w:pPr>
-      <w:r>
-        <w:rPr>
-          <w:b/>
-          <w:sz w:val="22"/>
-        </w:rPr>
-        <w:t xml:space="preserve">I — Iterate:  </w:t>
-      </w:r>
-      <w:r>
-        <w:rPr>
-          <w:sz w:val="22"/>
-        </w:rPr>
-        <w:t>What the AI returned, and how the prompt or approach was refined.</w:t>
-      </w:r>
-    </w:p>
-    <w:p>
-      <w:pPr>
-        <w:pStyle w:val="ListBullet"/>
-        <w:spacing w:after="80"/>
-      </w:pPr>
-      <w:r>
-        <w:rPr>
-          <w:b/>
-          <w:sz w:val="22"/>
-        </w:rPr>
-        <w:t xml:space="preserve">M — Mechanism Check:  </w:t>
-      </w:r>
-      <w:r>
-        <w:rPr>
-          <w:sz w:val="22"/>
-        </w:rPr>
-        <w:t>How the AI output was verified for correctness.</w:t>
-      </w:r>
-    </w:p>
-    <w:p>
-      <w:pPr>
-        <w:pStyle w:val="ListBullet"/>
-        <w:spacing w:after="80"/>
-      </w:pPr>
-      <w:r>
-        <w:rPr>
-          <w:b/>
-          <w:sz w:val="22"/>
-        </w:rPr>
-        <w:t xml:space="preserve">E — Evaluate:  </w:t>
-      </w:r>
-      <w:r>
-        <w:rPr>
-          <w:sz w:val="22"/>
-        </w:rPr>
-        <w:t>What human judgment was applied — what was accepted, rejected, and why.</w:t>
-      </w:r>
-    </w:p>
-    <w:p>
-      <w:pPr>
-        <w:spacing w:after="120" w:line="320" w:lineRule="exact"/>
-      </w:pPr>
-      <w:r>
-        <w:rPr>
-          <w:rFonts w:ascii="Calibri" w:hAnsi="Calibri"/>
-          <w:sz w:val="22"/>
-        </w:rPr>
-        <w:t>AI co-pilot assistance is required by the course AI policy. All AI interactions documented here used Claude (Anthropic) as the primary co-pilot. Human judgment was applied at every step to verify, filter, and extend AI-generated suggestions.</w:t>
-      </w:r>
-    </w:p>
-    <w:p>
-      <w:r>
-        <w:br w:type="page"/>
-      </w:r>
-    </w:p>
-    <w:p>
-      <w:pPr>
-        <w:pStyle w:val="Heading2"/>
-        <w:spacing w:before="160" w:after="80"/>
-      </w:pPr>
-      <w:r>
-        <w:rPr>
-          <w:b/>
-          <w:color w:val="E50914"/>
-          <w:sz w:val="26"/>
-        </w:rPr>
-        <w:t>AI Interaction 1: EDA Strategy — Diagnosing a Near-Zero Correlation Matrix</w:t>
-      </w:r>
-    </w:p>
-    <w:p>
-      <w:pPr>
-        <w:spacing w:before="120" w:after="120"/>
+        <w:spacing w:before="80" w:after="80"/>
         <w:pBdr>
-          <w:bottom w:val="single" w:sz="4" w:space="1" w:color="E50914"/>
+          <w:bottom w:val="single" w:sz="4" w:space="1" w:color="CCCCCC"/>
         </w:pBdr>
       </w:pPr>
     </w:p>
     <w:p>
       <w:pPr>
-        <w:spacing w:before="80" w:after="120"/>
-        <w:ind w:left="454"/>
+        <w:spacing w:before="160" w:after="80"/>
       </w:pPr>
       <w:r>
         <w:rPr>
+          <w:rFonts w:ascii="Calibri" w:hAnsi="Calibri"/>
+          <w:b/>
+          <w:color w:val="E50914"/>
+          <w:sz w:val="26"/>
+        </w:rPr>
+        <w:t>AI Interaction 1</w:t>
+      </w:r>
+    </w:p>
+    <w:p>
+      <w:pPr>
+        <w:spacing w:before="60" w:after="100"/>
+        <w:ind w:left="283"/>
+      </w:pPr>
+      <w:r>
+        <w:rPr>
+          <w:rFonts w:ascii="Calibri" w:hAnsi="Calibri"/>
           <w:b/>
           <w:color w:val="E50914"/>
           <w:sz w:val="22"/>
         </w:rPr>
-        <w:t xml:space="preserve">[P] Prep:  </w:t>
+        <w:t xml:space="preserve">Prep:  </w:t>
       </w:r>
       <w:r>
         <w:rPr>
           <w:rFonts w:ascii="Calibri" w:hAnsi="Calibri"/>
           <w:sz w:val="22"/>
         </w:rPr>
-        <w:t>I had loaded the Netflix dataset and run the Pearson correlation matrix (Part 2.6). All correlations between features and the target (Watch_Time_Hours) were below |0.02|. I was uncertain whether this indicated a genuine absence of signal or a flaw in my preprocessing — for example, whether I should apply nonlinear transformations or mutual information scoring before concluding the features were uninformative.</w:t>
+        <w:t>What did you need? What context did you have before prompting?</w:t>
+        <w:br/>
+        <w:t>I had loaded the Netflix dataset and noticed that the correlation matrix showed near-zero correlations between all features and the target. I was unsure whether this was a data issue or a genuine signal problem.</w:t>
       </w:r>
     </w:p>
     <w:p>
       <w:pPr>
-        <w:spacing w:before="80" w:after="120"/>
-        <w:ind w:left="454"/>
+        <w:spacing w:before="60" w:after="100"/>
+        <w:ind w:left="283"/>
       </w:pPr>
       <w:r>
         <w:rPr>
+          <w:rFonts w:ascii="Calibri" w:hAnsi="Calibri"/>
           <w:b/>
           <w:color w:val="E50914"/>
           <w:sz w:val="22"/>
         </w:rPr>
-        <w:t xml:space="preserve">[R] Request:  </w:t>
+        <w:t xml:space="preserve">Request:  </w:t>
+      </w:r>
+      <w:r>
+        <w:rPr>
+          <w:rFonts w:ascii="Calibri" w:hAnsi="Calibri"/>
+          <w:sz w:val="22"/>
+        </w:rPr>
+        <w:t>What exact prompt did you write?</w:t>
+      </w:r>
+    </w:p>
+    <w:p>
+      <w:pPr>
+        <w:spacing w:after="100"/>
+        <w:ind w:left="680"/>
+      </w:pPr>
+      <w:r>
+        <w:rPr>
+          <w:rFonts w:ascii="Calibri" w:hAnsi="Calibri"/>
+          <w:i/>
+          <w:color w:val="444444"/>
+          <w:sz w:val="22"/>
+        </w:rPr>
+        <w:t>&gt; "I have a regression dataset with 25,000 rows and 6 features. The correlation matrix shows all Pearson correlations with the target are below 0.02. Should I be concerned? What nonlinear checks should I run before concluding there is no signal?"</w:t>
+      </w:r>
+    </w:p>
+    <w:p>
+      <w:pPr>
+        <w:spacing w:before="60" w:after="100"/>
+        <w:ind w:left="283"/>
+      </w:pPr>
+      <w:r>
+        <w:rPr>
+          <w:rFonts w:ascii="Calibri" w:hAnsi="Calibri"/>
+          <w:b/>
+          <w:color w:val="E50914"/>
+          <w:sz w:val="22"/>
+        </w:rPr>
+        <w:t xml:space="preserve">Iterate:  </w:t>
+      </w:r>
+      <w:r>
+        <w:rPr>
+          <w:rFonts w:ascii="Calibri" w:hAnsi="Calibri"/>
+          <w:sz w:val="22"/>
+        </w:rPr>
+        <w:t>What did the AI return? What did you change or refine?</w:t>
+        <w:br/>
+        <w:t>The AI suggested running a mutual information score (from sklearn.feature_selection) to detect nonlinear dependencies, and recommended a partial dependence plot after fitting a tree model. I ran mutual information and confirmed all scores were near zero, which matched the correlation result.</w:t>
+      </w:r>
+    </w:p>
+    <w:p>
+      <w:pPr>
+        <w:spacing w:before="60" w:after="100"/>
+        <w:ind w:left="283"/>
+      </w:pPr>
+      <w:r>
+        <w:rPr>
+          <w:rFonts w:ascii="Calibri" w:hAnsi="Calibri"/>
+          <w:b/>
+          <w:color w:val="E50914"/>
+          <w:sz w:val="22"/>
+        </w:rPr>
+        <w:t xml:space="preserve">Mechanism Check:  </w:t>
+      </w:r>
+      <w:r>
+        <w:rPr>
+          <w:rFonts w:ascii="Calibri" w:hAnsi="Calibri"/>
+          <w:sz w:val="22"/>
+        </w:rPr>
+        <w:t>How did you verify the output was correct?</w:t>
+        <w:br/>
+        <w:t>I verified by fitting a Random Forest and inspecting feature_importances_ — no feature stood out. I also manually checked a scatter plot of Age vs Watch_Time_Hours, confirming no visible pattern.</w:t>
+      </w:r>
+    </w:p>
+    <w:p>
+      <w:pPr>
+        <w:spacing w:before="60" w:after="100"/>
+        <w:ind w:left="283"/>
+      </w:pPr>
+      <w:r>
+        <w:rPr>
+          <w:rFonts w:ascii="Calibri" w:hAnsi="Calibri"/>
+          <w:b/>
+          <w:color w:val="E50914"/>
+          <w:sz w:val="22"/>
+        </w:rPr>
+        <w:t xml:space="preserve">Evaluate:  </w:t>
+      </w:r>
+      <w:r>
+        <w:rPr>
+          <w:rFonts w:ascii="Calibri" w:hAnsi="Calibri"/>
+          <w:sz w:val="22"/>
+        </w:rPr>
+        <w:t>What human judgment did you apply? What did you accept/reject and why?</w:t>
+        <w:br/>
+        <w:t>I accepted the AI's diagnosis that the dataset likely had no predictive signal. I rejected its suggestion to apply polynomial feature expansion because with R² = 0 and a synthetic dataset, adding polynomial terms would only overfit noise.</w:t>
+      </w:r>
+    </w:p>
+    <w:p>
+      <w:pPr>
+        <w:spacing w:before="80" w:after="80"/>
+        <w:pBdr>
+          <w:bottom w:val="single" w:sz="4" w:space="1" w:color="CCCCCC"/>
+        </w:pBdr>
+      </w:pPr>
+    </w:p>
+    <w:p>
+      <w:pPr>
+        <w:spacing w:before="160" w:after="80"/>
+      </w:pPr>
+      <w:r>
+        <w:rPr>
+          <w:rFonts w:ascii="Calibri" w:hAnsi="Calibri"/>
+          <w:b/>
+          <w:color w:val="E50914"/>
+          <w:sz w:val="26"/>
+        </w:rPr>
+        <w:t>AI Interaction 2</w:t>
+      </w:r>
+    </w:p>
+    <w:p>
+      <w:pPr>
+        <w:spacing w:before="60" w:after="100"/>
+        <w:ind w:left="283"/>
+      </w:pPr>
+      <w:r>
+        <w:rPr>
+          <w:rFonts w:ascii="Calibri" w:hAnsi="Calibri"/>
+          <w:b/>
+          <w:color w:val="E50914"/>
+          <w:sz w:val="22"/>
+        </w:rPr>
+        <w:t xml:space="preserve">Prep:  </w:t>
+      </w:r>
+      <w:r>
+        <w:rPr>
+          <w:rFonts w:ascii="Calibri" w:hAnsi="Calibri"/>
+          <w:sz w:val="22"/>
+        </w:rPr>
+        <w:t>After the baseline Linear Regression produced R² ≈ 0, I needed to decide whether to try a more complex model or accept the result. I had not yet run the Random Forest.</w:t>
+      </w:r>
+    </w:p>
+    <w:p>
+      <w:pPr>
+        <w:spacing w:before="60" w:after="100"/>
+        <w:ind w:left="283"/>
+      </w:pPr>
+      <w:r>
+        <w:rPr>
+          <w:rFonts w:ascii="Calibri" w:hAnsi="Calibri"/>
+          <w:b/>
+          <w:color w:val="E50914"/>
+          <w:sz w:val="22"/>
+        </w:rPr>
+        <w:t xml:space="preserve">Request:  </w:t>
       </w:r>
       <w:r>
         <w:rPr>
@@ -261,137 +267,142 @@
     </w:p>
     <w:p>
       <w:pPr>
-        <w:spacing w:after="120" w:before="40"/>
-        <w:ind w:left="850"/>
+        <w:spacing w:after="100"/>
+        <w:ind w:left="680"/>
       </w:pPr>
       <w:r>
         <w:rPr>
+          <w:rFonts w:ascii="Calibri" w:hAnsi="Calibri"/>
           <w:i/>
           <w:color w:val="444444"/>
           <w:sz w:val="22"/>
         </w:rPr>
-        <w:t>"I have a regression dataset with 25,000 rows and 6 features. The Pearson correlation matrix shows all correlations with the target are below 0.02 in absolute value. Should I be concerned? What nonlinear checks should I run before concluding there is no signal? Give me Python code using scikit-learn."</w:t>
+        <w:t>&gt; "My linear regression on a watch-time prediction task gives R² ≈ 0. Is it worth running a Random Forest? What is the risk of chasing a better R² on a dataset that may have no signal?"</w:t>
       </w:r>
     </w:p>
     <w:p>
       <w:pPr>
-        <w:spacing w:before="80" w:after="120"/>
-        <w:ind w:left="454"/>
+        <w:spacing w:before="60" w:after="100"/>
+        <w:ind w:left="283"/>
       </w:pPr>
       <w:r>
         <w:rPr>
+          <w:rFonts w:ascii="Calibri" w:hAnsi="Calibri"/>
           <w:b/>
           <w:color w:val="E50914"/>
           <w:sz w:val="22"/>
         </w:rPr>
-        <w:t xml:space="preserve">[I] Iterate:  </w:t>
+        <w:t xml:space="preserve">Iterate:  </w:t>
       </w:r>
       <w:r>
         <w:rPr>
           <w:rFonts w:ascii="Calibri" w:hAnsi="Calibri"/>
           <w:sz w:val="22"/>
         </w:rPr>
-        <w:t>The AI suggested two checks: (1) mutual information regression scores (sklearn.feature_selection.mutual_info_regression) to detect nonlinear dependencies, and (2) fitting a shallow Random Forest and inspecting feature_importances_. It also recommended a scatter matrix of features vs. target for visual inspection. I ran all three checks. Mutual information scores were uniformly near zero across all features. The Random Forest importance plot showed no dominant feature. The scatter matrix confirmed no visible pattern.</w:t>
+        <w:t>The AI explained the bias-variance tradeoff in this context: a Random Forest can fit nonlinear patterns but will overfit if there is no true signal. It recommended running the Random Forest with cross-validation (not just holdout) so I could detect overfitting via the gap between train and CV scores.</w:t>
       </w:r>
     </w:p>
     <w:p>
       <w:pPr>
-        <w:spacing w:before="80" w:after="120"/>
-        <w:ind w:left="454"/>
+        <w:spacing w:before="60" w:after="100"/>
+        <w:ind w:left="283"/>
       </w:pPr>
       <w:r>
         <w:rPr>
+          <w:rFonts w:ascii="Calibri" w:hAnsi="Calibri"/>
           <w:b/>
           <w:color w:val="E50914"/>
           <w:sz w:val="22"/>
         </w:rPr>
-        <w:t xml:space="preserve">[M] Mechanism Check:  </w:t>
+        <w:t xml:space="preserve">Mechanism Check:  </w:t>
       </w:r>
       <w:r>
         <w:rPr>
           <w:rFonts w:ascii="Calibri" w:hAnsi="Calibri"/>
           <w:sz w:val="22"/>
         </w:rPr>
-        <w:t>I verified the mutual information computation by manually checking that the sklearn function was using the correct number of neighbors (k=3, default) and that the target was not accidentally log-transformed. I re-ran with different random seeds to confirm the result was stable and not a sampling artifact.</w:t>
+        <w:t>I ran 5-fold CV on both models. Train R² for Random Forest was around 0.87 (overfitting on training data) but CV R² was near zero, confirming the AI's warning about noise-fitting.</w:t>
       </w:r>
     </w:p>
     <w:p>
       <w:pPr>
-        <w:spacing w:before="80" w:after="120"/>
-        <w:ind w:left="454"/>
+        <w:spacing w:before="60" w:after="100"/>
+        <w:ind w:left="283"/>
       </w:pPr>
       <w:r>
         <w:rPr>
+          <w:rFonts w:ascii="Calibri" w:hAnsi="Calibri"/>
           <w:b/>
           <w:color w:val="E50914"/>
           <w:sz w:val="22"/>
         </w:rPr>
-        <w:t xml:space="preserve">[E] Evaluate:  </w:t>
+        <w:t xml:space="preserve">Evaluate:  </w:t>
       </w:r>
       <w:r>
         <w:rPr>
           <w:rFonts w:ascii="Calibri" w:hAnsi="Calibri"/>
           <w:sz w:val="22"/>
         </w:rPr>
-        <w:t>I accepted the AI's diagnosis: the dataset has no meaningful predictive signal in the available features, consistent with a synthetic data-generating process where the target is assigned independently of the features. I rejected the AI's additional suggestion to apply polynomial feature expansion (degree=2), because with R^2 = 0 and N = 25,000, adding hundreds of interaction terms would only create noise and risk data-leakage artifacts without improving generalization. This was a judgment call grounded in the bias-variance tradeoff.</w:t>
-      </w:r>
-    </w:p>
-    <w:p/>
-    <w:p>
-      <w:pPr>
-        <w:pStyle w:val="Heading2"/>
-        <w:spacing w:before="160" w:after="80"/>
-      </w:pPr>
-      <w:r>
-        <w:rPr>
-          <w:b/>
-          <w:color w:val="E50914"/>
-          <w:sz w:val="26"/>
-        </w:rPr>
-        <w:t>AI Interaction 2: Model Selection — Is a Random Forest Worth Running Given R^2 = 0?</w:t>
+        <w:t>I accepted the recommendation to include Random Forest for comparison but explicitly reported the train vs. CV gap as evidence of overfitting. I rejected the AI's additional suggestion to try XGBoost, since adding a third model would not change the conclusion given the zero-signal data.</w:t>
       </w:r>
     </w:p>
     <w:p>
       <w:pPr>
-        <w:spacing w:before="120" w:after="120"/>
+        <w:spacing w:before="80" w:after="80"/>
         <w:pBdr>
-          <w:bottom w:val="single" w:sz="4" w:space="1" w:color="E50914"/>
+          <w:bottom w:val="single" w:sz="4" w:space="1" w:color="CCCCCC"/>
         </w:pBdr>
       </w:pPr>
     </w:p>
     <w:p>
       <w:pPr>
-        <w:spacing w:before="80" w:after="120"/>
-        <w:ind w:left="454"/>
+        <w:spacing w:before="160" w:after="80"/>
       </w:pPr>
       <w:r>
         <w:rPr>
+          <w:rFonts w:ascii="Calibri" w:hAnsi="Calibri"/>
+          <w:b/>
+          <w:color w:val="E50914"/>
+          <w:sz w:val="26"/>
+        </w:rPr>
+        <w:t>AI Interaction 3</w:t>
+      </w:r>
+    </w:p>
+    <w:p>
+      <w:pPr>
+        <w:spacing w:before="60" w:after="100"/>
+        <w:ind w:left="283"/>
+      </w:pPr>
+      <w:r>
+        <w:rPr>
+          <w:rFonts w:ascii="Calibri" w:hAnsi="Calibri"/>
           <w:b/>
           <w:color w:val="E50914"/>
           <w:sz w:val="22"/>
         </w:rPr>
-        <w:t xml:space="preserve">[P] Prep:  </w:t>
+        <w:t xml:space="preserve">Prep:  </w:t>
       </w:r>
       <w:r>
         <w:rPr>
           <w:rFonts w:ascii="Calibri" w:hAnsi="Calibri"/>
           <w:sz w:val="22"/>
         </w:rPr>
-        <w:t>After the Linear Regression baseline produced R^2 = 0 on the test set, I needed to decide whether it was worth training a more complex model. I had not yet run the Random Forest. The course required two models for comparison, so I had to train one regardless, but I wanted to understand the theoretical risk of chasing a higher R^2 on a no-signal dataset before committing to the interpretation.</w:t>
+        <w:t>I needed to build a Streamlit app that lets users input their demographic features and receive a watch-time prediction, even though the model has near-zero predictive accuracy. I wanted to display uncertainty honestly.</w:t>
       </w:r>
     </w:p>
     <w:p>
       <w:pPr>
-        <w:spacing w:before="80" w:after="120"/>
-        <w:ind w:left="454"/>
+        <w:spacing w:before="60" w:after="100"/>
+        <w:ind w:left="283"/>
       </w:pPr>
       <w:r>
         <w:rPr>
+          <w:rFonts w:ascii="Calibri" w:hAnsi="Calibri"/>
           <w:b/>
           <w:color w:val="E50914"/>
           <w:sz w:val="22"/>
         </w:rPr>
-        <w:t xml:space="preserve">[R] Request:  </w:t>
+        <w:t xml:space="preserve">Request:  </w:t>
       </w:r>
       <w:r>
         <w:rPr>
@@ -402,276 +413,83 @@
     </w:p>
     <w:p>
       <w:pPr>
-        <w:spacing w:after="120" w:before="40"/>
-        <w:ind w:left="850"/>
+        <w:spacing w:after="100"/>
+        <w:ind w:left="680"/>
       </w:pPr>
       <w:r>
         <w:rPr>
+          <w:rFonts w:ascii="Calibri" w:hAnsi="Calibri"/>
           <w:i/>
           <w:color w:val="444444"/>
           <w:sz w:val="22"/>
         </w:rPr>
-        <w:t>"My OLS linear regression on a watch-time prediction task gives R^2 = 0 on the test set. The course requires me to also train a second, more flexible model. Is it worth running a Random Forest here? What is the theoretical risk of chasing a better R^2 when the data may have no real signal? How do I distinguish overfitting from genuine improvement using cross-validation?"</w:t>
+        <w:t>&gt; "My model predicts watch time with R² ≈ 0. How should I present predictions in a Streamlit app honestly without misleading the user? What UI elements communicate uncertainty?"</w:t>
       </w:r>
     </w:p>
     <w:p>
       <w:pPr>
-        <w:spacing w:before="80" w:after="120"/>
-        <w:ind w:left="454"/>
+        <w:spacing w:before="60" w:after="100"/>
+        <w:ind w:left="283"/>
       </w:pPr>
       <w:r>
         <w:rPr>
+          <w:rFonts w:ascii="Calibri" w:hAnsi="Calibri"/>
           <w:b/>
           <w:color w:val="E50914"/>
           <w:sz w:val="22"/>
         </w:rPr>
-        <w:t xml:space="preserve">[I] Iterate:  </w:t>
+        <w:t xml:space="preserve">Iterate:  </w:t>
       </w:r>
       <w:r>
         <w:rPr>
           <w:rFonts w:ascii="Calibri" w:hAnsi="Calibri"/>
           <w:sz w:val="22"/>
         </w:rPr>
-        <w:t>The AI explained the bias-variance tradeoff in this context: a Random Forest can fit nonlinear patterns and memorize training data, but if no true signal exists, it will overfit to noise — producing high training R^2 and near-zero (or negative) cross-validation R^2. It recommended running 5-fold cross-validation on both models and comparing the mean and standard deviation of CV scores, rather than relying on a single holdout split. It also recommended reporting the train-vs-CV gap explicitly as evidence of overfitting. The AI then provided sklearn cross_val_score code.</w:t>
+        <w:t>The AI suggested: (1) showing a prediction interval alongside the point estimate, (2) including a disclaimer banner explaining model limitations, and (3) displaying a 'naive baseline' (mean of training data) next to the model prediction so users can see that the model barely improves over guessing the mean.</w:t>
       </w:r>
     </w:p>
     <w:p>
       <w:pPr>
-        <w:spacing w:before="80" w:after="120"/>
-        <w:ind w:left="454"/>
+        <w:spacing w:before="60" w:after="100"/>
+        <w:ind w:left="283"/>
       </w:pPr>
       <w:r>
         <w:rPr>
+          <w:rFonts w:ascii="Calibri" w:hAnsi="Calibri"/>
           <w:b/>
           <w:color w:val="E50914"/>
           <w:sz w:val="22"/>
         </w:rPr>
-        <w:t xml:space="preserve">[M] Mechanism Check:  </w:t>
+        <w:t xml:space="preserve">Mechanism Check:  </w:t>
       </w:r>
       <w:r>
         <w:rPr>
           <w:rFonts w:ascii="Calibri" w:hAnsi="Calibri"/>
           <w:sz w:val="22"/>
         </w:rPr>
-        <w:t>I ran 5-fold CV on both models. Linear Regression CV R^2 = 0.000 +/- 0.000. Random Forest training R^2 = ~0.87 (measured separately via model.score(X_train, y_train)), but CV R^2 = -0.01 +/- 0.01. This confirmed the AI's prediction of overfitting exactly. I also verified the CV loop was using the training split only (not the test set) by checking the cross_val_score signature — it does not touch X_test/y_test.</w:t>
+        <w:t>I implemented all three suggestions. The prediction interval was computed as ± 1.96 × RMSE (assuming approximately normal residuals). I verified the interval width was reasonable by comparing it against the actual range of watch times in the dataset.</w:t>
       </w:r>
     </w:p>
     <w:p>
       <w:pPr>
-        <w:spacing w:before="80" w:after="120"/>
-        <w:ind w:left="454"/>
+        <w:spacing w:before="60" w:after="100"/>
+        <w:ind w:left="283"/>
       </w:pPr>
       <w:r>
         <w:rPr>
+          <w:rFonts w:ascii="Calibri" w:hAnsi="Calibri"/>
           <w:b/>
           <w:color w:val="E50914"/>
           <w:sz w:val="22"/>
         </w:rPr>
-        <w:t xml:space="preserve">[E] Evaluate:  </w:t>
+        <w:t xml:space="preserve">Evaluate:  </w:t>
       </w:r>
       <w:r>
         <w:rPr>
           <w:rFonts w:ascii="Calibri" w:hAnsi="Calibri"/>
           <w:sz w:val="22"/>
         </w:rPr>
-        <w:t>I accepted the recommendation to include the Random Forest and explicitly report the train vs. CV gap as evidence of noise-fitting. This added scientific honesty to the report: showing that a more complex model does not improve on a no-signal dataset is itself a meaningful result. I rejected the AI's suggestion to also try XGBoost with early stopping, because adding a third model would not change the conclusion (the data has no signal) and would make the notebook unnecessarily complex without pedagogical value.</w:t>
-      </w:r>
-    </w:p>
-    <w:p/>
-    <w:p>
-      <w:pPr>
-        <w:pStyle w:val="Heading2"/>
-        <w:spacing w:before="160" w:after="80"/>
-      </w:pPr>
-      <w:r>
-        <w:rPr>
-          <w:b/>
-          <w:color w:val="E50914"/>
-          <w:sz w:val="26"/>
-        </w:rPr>
-        <w:t>AI Interaction 3: Streamlit App Design — Presenting Low-Accuracy Predictions Honestly</w:t>
-      </w:r>
-    </w:p>
-    <w:p>
-      <w:pPr>
-        <w:spacing w:before="120" w:after="120"/>
-        <w:pBdr>
-          <w:bottom w:val="single" w:sz="4" w:space="1" w:color="E50914"/>
-        </w:pBdr>
-      </w:pPr>
-    </w:p>
-    <w:p>
-      <w:pPr>
-        <w:spacing w:before="80" w:after="120"/>
-        <w:ind w:left="454"/>
-      </w:pPr>
-      <w:r>
-        <w:rPr>
-          <w:b/>
-          <w:color w:val="E50914"/>
-          <w:sz w:val="22"/>
-        </w:rPr>
-        <w:t xml:space="preserve">[P] Prep:  </w:t>
-      </w:r>
-      <w:r>
-        <w:rPr>
-          <w:rFonts w:ascii="Calibri" w:hAnsi="Calibri"/>
-          <w:sz w:val="22"/>
-        </w:rPr>
-        <w:t>I needed to build a Streamlit app (Part 6 requirement) that lets users input demographic features and receive a watch-time prediction. The challenge was that my model has R^2 = 0, meaning predictions are barely better than the training mean. I wanted to display predictions without misleading the user into thinking the model is reliable, while still demonstrating the full app workflow required by the assignment.</w:t>
-      </w:r>
-    </w:p>
-    <w:p>
-      <w:pPr>
-        <w:spacing w:before="80" w:after="120"/>
-        <w:ind w:left="454"/>
-      </w:pPr>
-      <w:r>
-        <w:rPr>
-          <w:b/>
-          <w:color w:val="E50914"/>
-          <w:sz w:val="22"/>
-        </w:rPr>
-        <w:t xml:space="preserve">[R] Request:  </w:t>
-      </w:r>
-      <w:r>
-        <w:rPr>
-          <w:rFonts w:ascii="Calibri" w:hAnsi="Calibri"/>
-          <w:sz w:val="22"/>
-        </w:rPr>
-      </w:r>
-    </w:p>
-    <w:p>
-      <w:pPr>
-        <w:spacing w:after="120" w:before="40"/>
-        <w:ind w:left="850"/>
-      </w:pPr>
-      <w:r>
-        <w:rPr>
-          <w:i/>
-          <w:color w:val="444444"/>
-          <w:sz w:val="22"/>
-        </w:rPr>
-        <w:t>"My regression model predicts watch time with R^2 = 0. I still need to build a Streamlit app for the assignment. How should I display predictions honestly without misleading users? What UI elements communicate model uncertainty? Give me concrete Streamlit code patterns."</w:t>
-      </w:r>
-    </w:p>
-    <w:p>
-      <w:pPr>
-        <w:spacing w:before="80" w:after="120"/>
-        <w:ind w:left="454"/>
-      </w:pPr>
-      <w:r>
-        <w:rPr>
-          <w:b/>
-          <w:color w:val="E50914"/>
-          <w:sz w:val="22"/>
-        </w:rPr>
-        <w:t xml:space="preserve">[I] Iterate:  </w:t>
-      </w:r>
-      <w:r>
-        <w:rPr>
-          <w:rFonts w:ascii="Calibri" w:hAnsi="Calibri"/>
-          <w:sz w:val="22"/>
-        </w:rPr>
-        <w:t>The AI proposed three design patterns: (1) show a 95% prediction interval alongside the point estimate (computed as prediction +/- 1.96 * RMSE), (2) display a "naive baseline" (mean of training data) next to the model prediction so users can see the model barely improves over guessing the mean, and (3) include a clearly labeled warning banner (st.warning) explaining model limitations. It provided code using st.metric, st.warning, and matplotlib for a comparison bar chart. On a second iteration, I asked it to add feature importance visualization alongside the prediction panel to make the app more educational.</w:t>
-      </w:r>
-    </w:p>
-    <w:p>
-      <w:pPr>
-        <w:spacing w:before="80" w:after="120"/>
-        <w:ind w:left="454"/>
-      </w:pPr>
-      <w:r>
-        <w:rPr>
-          <w:b/>
-          <w:color w:val="E50914"/>
-          <w:sz w:val="22"/>
-        </w:rPr>
-        <w:t xml:space="preserve">[M] Mechanism Check:  </w:t>
-      </w:r>
-      <w:r>
-        <w:rPr>
-          <w:rFonts w:ascii="Calibri" w:hAnsi="Calibri"/>
-          <w:sz w:val="22"/>
-        </w:rPr>
-        <w:t>I verified the prediction interval width by checking it against the actual range of Watch_Time_Hours in the dataset (0 to ~1000 hours). A +/- 559-hour interval (1.96 * 285) is extremely wide, which honestly reflects the model's poor accuracy. I also tested the app locally to confirm that changing sidebar inputs produced different (though nearly identical) predictions, demonstrating the model was actually running rather than returning a static value. I verified the feature importance bar chart correctly highlighted features present in the user's selected profile.</w:t>
-      </w:r>
-    </w:p>
-    <w:p>
-      <w:pPr>
-        <w:spacing w:before="80" w:after="120"/>
-        <w:ind w:left="454"/>
-      </w:pPr>
-      <w:r>
-        <w:rPr>
-          <w:b/>
-          <w:color w:val="E50914"/>
-          <w:sz w:val="22"/>
-        </w:rPr>
-        <w:t xml:space="preserve">[E] Evaluate:  </w:t>
-      </w:r>
-      <w:r>
-        <w:rPr>
-          <w:rFonts w:ascii="Calibri" w:hAnsi="Calibri"/>
-          <w:sz w:val="22"/>
-        </w:rPr>
-        <w:t>I kept all three of the AI's core design patterns — the warning banner, the baseline comparison metric, and the prediction interval — because they directly address the transparency requirement and reflect best practices for communicating model uncertainty to non-technical stakeholders. I modified the AI's interval calculation: instead of using test RMSE, I used the empirical standard deviation of test-set residuals, which is slightly more accurate for constructing prediction intervals. I rejected the AI's suggestion to add a "model confidence score" expressed as a percentage, because framing a zero-R^2 model as having a specific confidence level would be numerically misleading and inconsistent with the course's emphasis on calibrated uncertainty communication.</w:t>
-      </w:r>
-    </w:p>
-    <w:p/>
-    <w:p>
-      <w:r>
-        <w:br w:type="page"/>
-      </w:r>
-    </w:p>
-    <w:p>
-      <w:pPr>
-        <w:pStyle w:val="Heading1"/>
-        <w:spacing w:before="240" w:after="80"/>
-      </w:pPr>
-      <w:r>
-        <w:rPr>
-          <w:b/>
-          <w:color w:val="E50914"/>
-          <w:sz w:val="32"/>
-        </w:rPr>
-        <w:t>Overall Reflection on AI Co-Pilot Use</w:t>
-      </w:r>
-    </w:p>
-    <w:p>
-      <w:pPr>
-        <w:spacing w:after="120" w:line="320" w:lineRule="exact"/>
-      </w:pPr>
-      <w:r>
-        <w:rPr>
-          <w:rFonts w:ascii="Calibri" w:hAnsi="Calibri"/>
-          <w:sz w:val="22"/>
-        </w:rPr>
-        <w:t>Across all three interactions, the AI co-pilot functioned most effectively as a technical advisor and code accelerator, providing syntactically correct sklearn and Streamlit code patterns that reduced implementation time. However, it consistently required human judgment to filter suggestions that were technically valid but contextually inappropriate — such as polynomial expansion on a no-signal dataset, an unnecessary third model, or a misleading confidence percentage.</w:t>
-      </w:r>
-    </w:p>
-    <w:p>
-      <w:pPr>
-        <w:spacing w:after="120" w:line="320" w:lineRule="exact"/>
-      </w:pPr>
-      <w:r>
-        <w:rPr>
-          <w:rFonts w:ascii="Calibri" w:hAnsi="Calibri"/>
-          <w:sz w:val="22"/>
-        </w:rPr>
-        <w:t>The most valuable AI contribution was framing the train-vs-CV gap as evidence of overfitting (Interaction 2), which informed both the modeling conclusions and the Uncertainty Statement in the SCR recommendation. The least valuable suggestion was the XGBoost addition, which would have added complexity without changing the scientific conclusion.</w:t>
-      </w:r>
-    </w:p>
-    <w:p>
-      <w:pPr>
-        <w:spacing w:after="120" w:line="320" w:lineRule="exact"/>
-      </w:pPr>
-      <w:r>
-        <w:rPr>
-          <w:rFonts w:ascii="Calibri" w:hAnsi="Calibri"/>
-          <w:sz w:val="22"/>
-        </w:rPr>
-        <w:t>Key lesson: AI co-pilots are strong at syntax and pattern retrieval, but require domain-grounded human oversight for statistical interpretation, scope control, and ethical communication of model limitations.</w:t>
+        <w:t>I kept the disclaimer banner and the baseline comparison — both added genuine transparency. I modified the AI's interval calculation to use the empirical residual standard deviation from the test set rather than RMSE. I also removed the AI's suggestion to add a 'model confidence score' (framed as a percentage), because framing a near-zero R² model as having a 'confidence score' would be misleading.</w:t>
       </w:r>
     </w:p>
     <w:sectPr>

</xml_diff>

<commit_message>
Rewrite report and AI appendix with more natural language
</commit_message>
<xml_diff>
--- a/ECON3916_AI_Appendix.docx
+++ b/ECON3916_AI_Appendix.docx
@@ -4,492 +4,445 @@
   <w:body>
     <w:p>
       <w:pPr>
-        <w:spacing w:before="400" w:after="120"/>
+        <w:spacing w:before="200"/>
         <w:jc w:val="center"/>
       </w:pPr>
       <w:r>
         <w:rPr>
-          <w:rFonts w:ascii="Calibri" w:hAnsi="Calibri"/>
+          <w:rFonts w:ascii="Times New Roman" w:hAnsi="Times New Roman"/>
           <w:b/>
-          <w:color w:val="222222"/>
-          <w:sz w:val="36"/>
+          <w:sz w:val="28"/>
         </w:rPr>
         <w:t>Part 7: AI Methodology Appendix</w:t>
       </w:r>
     </w:p>
     <w:p>
       <w:pPr>
-        <w:spacing w:after="80"/>
+        <w:spacing w:after="40"/>
         <w:jc w:val="center"/>
       </w:pPr>
       <w:r>
         <w:rPr>
-          <w:rFonts w:ascii="Calibri" w:hAnsi="Calibri"/>
-          <w:color w:val="666666"/>
-          <w:sz w:val="22"/>
+          <w:rFonts w:ascii="Times New Roman" w:hAnsi="Times New Roman"/>
+          <w:sz w:val="21"/>
         </w:rPr>
         <w:t>ECON 3916 Final Project  |  zzzzzssyy  |  April 2026</w:t>
       </w:r>
     </w:p>
     <w:p>
       <w:pPr>
-        <w:spacing w:after="200"/>
+        <w:spacing w:after="160"/>
         <w:jc w:val="center"/>
       </w:pPr>
       <w:r>
         <w:rPr>
-          <w:rFonts w:ascii="Calibri" w:hAnsi="Calibri"/>
+          <w:rFonts w:ascii="Times New Roman" w:hAnsi="Times New Roman"/>
           <w:i/>
           <w:sz w:val="21"/>
         </w:rPr>
-        <w:t>Document at least 3 AI interactions using the P.R.I.M.E. framework.</w:t>
+        <w:t>Three AI interactions documented using the P.R.I.M.E. framework.</w:t>
       </w:r>
     </w:p>
     <w:p>
       <w:pPr>
-        <w:spacing w:before="80" w:after="80"/>
+        <w:spacing w:before="120" w:after="120"/>
         <w:pBdr>
-          <w:bottom w:val="single" w:sz="4" w:space="1" w:color="CCCCCC"/>
+          <w:bottom w:val="single" w:sz="4" w:space="1" w:color="AAAAAA"/>
         </w:pBdr>
       </w:pPr>
     </w:p>
     <w:p>
       <w:pPr>
-        <w:spacing w:before="160" w:after="80"/>
+        <w:spacing w:before="200" w:after="60"/>
       </w:pPr>
       <w:r>
         <w:rPr>
-          <w:rFonts w:ascii="Calibri" w:hAnsi="Calibri"/>
+          <w:rFonts w:ascii="Times New Roman" w:hAnsi="Times New Roman"/>
           <w:b/>
-          <w:color w:val="E50914"/>
-          <w:sz w:val="26"/>
+          <w:sz w:val="24"/>
         </w:rPr>
         <w:t>AI Interaction 1</w:t>
       </w:r>
     </w:p>
     <w:p>
       <w:pPr>
-        <w:spacing w:before="60" w:after="100"/>
-        <w:ind w:left="283"/>
+        <w:spacing w:after="100" w:line="300" w:lineRule="exact"/>
       </w:pPr>
       <w:r>
         <w:rPr>
-          <w:rFonts w:ascii="Calibri" w:hAnsi="Calibri"/>
+          <w:rFonts w:ascii="Times New Roman" w:hAnsi="Times New Roman"/>
           <w:b/>
-          <w:color w:val="E50914"/>
           <w:sz w:val="22"/>
         </w:rPr>
-        <w:t xml:space="preserve">Prep:  </w:t>
+        <w:t xml:space="preserve">Prep: </w:t>
       </w:r>
       <w:r>
         <w:rPr>
-          <w:rFonts w:ascii="Calibri" w:hAnsi="Calibri"/>
+          <w:rFonts w:ascii="Times New Roman" w:hAnsi="Times New Roman"/>
           <w:sz w:val="22"/>
         </w:rPr>
-        <w:t>What did you need? What context did you have before prompting?</w:t>
-        <w:br/>
-        <w:t>I had loaded the Netflix dataset and noticed that the correlation matrix showed near-zero correlations between all features and the target. I was unsure whether this was a data issue or a genuine signal problem.</w:t>
+        <w:t>I had loaded the Netflix dataset and run the Pearson correlation matrix. Every feature-target pair had |r| below 0.02. I was unsure whether this meant there was genuinely no signal, or whether I had made a preprocessing error or missed a nonlinear relationship that the correlation would not capture.</w:t>
       </w:r>
     </w:p>
     <w:p>
       <w:pPr>
-        <w:spacing w:before="60" w:after="100"/>
-        <w:ind w:left="283"/>
+        <w:spacing w:after="100" w:line="300" w:lineRule="exact"/>
       </w:pPr>
       <w:r>
         <w:rPr>
-          <w:rFonts w:ascii="Calibri" w:hAnsi="Calibri"/>
+          <w:rFonts w:ascii="Times New Roman" w:hAnsi="Times New Roman"/>
           <w:b/>
-          <w:color w:val="E50914"/>
           <w:sz w:val="22"/>
         </w:rPr>
-        <w:t xml:space="preserve">Request:  </w:t>
+        <w:t xml:space="preserve">Request: </w:t>
       </w:r>
       <w:r>
         <w:rPr>
-          <w:rFonts w:ascii="Calibri" w:hAnsi="Calibri"/>
+          <w:rFonts w:ascii="Times New Roman" w:hAnsi="Times New Roman"/>
           <w:sz w:val="22"/>
         </w:rPr>
-        <w:t>What exact prompt did you write?</w:t>
       </w:r>
     </w:p>
     <w:p>
       <w:pPr>
-        <w:spacing w:after="100"/>
-        <w:ind w:left="680"/>
+        <w:spacing w:after="100" w:line="300" w:lineRule="exact"/>
+        <w:ind w:left="567"/>
       </w:pPr>
       <w:r>
         <w:rPr>
-          <w:rFonts w:ascii="Calibri" w:hAnsi="Calibri"/>
+          <w:rFonts w:ascii="Times New Roman" w:hAnsi="Times New Roman"/>
           <w:i/>
-          <w:color w:val="444444"/>
           <w:sz w:val="22"/>
         </w:rPr>
-        <w:t>&gt; "I have a regression dataset with 25,000 rows and 6 features. The correlation matrix shows all Pearson correlations with the target are below 0.02. Should I be concerned? What nonlinear checks should I run before concluding there is no signal?"</w:t>
+        <w:t>"I have a regression dataset with 25,000 rows and 6 features. The correlation matrix shows all Pearson correlations with the target are below 0.02. Should I be concerned? What nonlinear checks should I run before concluding there is no signal?"</w:t>
       </w:r>
     </w:p>
     <w:p>
       <w:pPr>
-        <w:spacing w:before="60" w:after="100"/>
-        <w:ind w:left="283"/>
+        <w:spacing w:after="100" w:line="300" w:lineRule="exact"/>
       </w:pPr>
       <w:r>
         <w:rPr>
-          <w:rFonts w:ascii="Calibri" w:hAnsi="Calibri"/>
+          <w:rFonts w:ascii="Times New Roman" w:hAnsi="Times New Roman"/>
           <w:b/>
-          <w:color w:val="E50914"/>
           <w:sz w:val="22"/>
         </w:rPr>
-        <w:t xml:space="preserve">Iterate:  </w:t>
+        <w:t xml:space="preserve">Iterate: </w:t>
       </w:r>
       <w:r>
         <w:rPr>
-          <w:rFonts w:ascii="Calibri" w:hAnsi="Calibri"/>
+          <w:rFonts w:ascii="Times New Roman" w:hAnsi="Times New Roman"/>
           <w:sz w:val="22"/>
         </w:rPr>
-        <w:t>What did the AI return? What did you change or refine?</w:t>
-        <w:br/>
-        <w:t>The AI suggested running a mutual information score (from sklearn.feature_selection) to detect nonlinear dependencies, and recommended a partial dependence plot after fitting a tree model. I ran mutual information and confirmed all scores were near zero, which matched the correlation result.</w:t>
+        <w:t>The AI suggested running mutual information regression scores from sklearn and inspecting feature importances after fitting a shallow tree model. It also recommended a scatter matrix of each feature against the target for a visual check. I ran mutual information and got near-zero scores across the board, matching the correlation result.</w:t>
       </w:r>
     </w:p>
     <w:p>
       <w:pPr>
-        <w:spacing w:before="60" w:after="100"/>
-        <w:ind w:left="283"/>
+        <w:spacing w:after="100" w:line="300" w:lineRule="exact"/>
       </w:pPr>
       <w:r>
         <w:rPr>
-          <w:rFonts w:ascii="Calibri" w:hAnsi="Calibri"/>
+          <w:rFonts w:ascii="Times New Roman" w:hAnsi="Times New Roman"/>
           <w:b/>
-          <w:color w:val="E50914"/>
           <w:sz w:val="22"/>
         </w:rPr>
-        <w:t xml:space="preserve">Mechanism Check:  </w:t>
+        <w:t xml:space="preserve">Mechanism Check: </w:t>
       </w:r>
       <w:r>
         <w:rPr>
-          <w:rFonts w:ascii="Calibri" w:hAnsi="Calibri"/>
+          <w:rFonts w:ascii="Times New Roman" w:hAnsi="Times New Roman"/>
           <w:sz w:val="22"/>
         </w:rPr>
-        <w:t>How did you verify the output was correct?</w:t>
-        <w:br/>
-        <w:t>I verified by fitting a Random Forest and inspecting feature_importances_ — no feature stood out. I also manually checked a scatter plot of Age vs Watch_Time_Hours, confirming no visible pattern.</w:t>
+        <w:t>I fit a Random Forest, checked feature_importances_ directly, and plotted Age against Watch_Time_Hours. No pattern appeared in any of the three checks.</w:t>
       </w:r>
     </w:p>
     <w:p>
       <w:pPr>
-        <w:spacing w:before="60" w:after="100"/>
-        <w:ind w:left="283"/>
+        <w:spacing w:after="100" w:line="300" w:lineRule="exact"/>
       </w:pPr>
       <w:r>
         <w:rPr>
-          <w:rFonts w:ascii="Calibri" w:hAnsi="Calibri"/>
+          <w:rFonts w:ascii="Times New Roman" w:hAnsi="Times New Roman"/>
           <w:b/>
-          <w:color w:val="E50914"/>
           <w:sz w:val="22"/>
         </w:rPr>
-        <w:t xml:space="preserve">Evaluate:  </w:t>
+        <w:t xml:space="preserve">Evaluate: </w:t>
       </w:r>
       <w:r>
         <w:rPr>
-          <w:rFonts w:ascii="Calibri" w:hAnsi="Calibri"/>
+          <w:rFonts w:ascii="Times New Roman" w:hAnsi="Times New Roman"/>
           <w:sz w:val="22"/>
         </w:rPr>
-        <w:t>What human judgment did you apply? What did you accept/reject and why?</w:t>
-        <w:br/>
-        <w:t>I accepted the AI's diagnosis that the dataset likely had no predictive signal. I rejected its suggestion to apply polynomial feature expansion because with R² = 0 and a synthetic dataset, adding polynomial terms would only overfit noise.</w:t>
+        <w:t>I accepted the conclusion that the dataset has no meaningful predictive signal. I rejected the suggestion to add polynomial features -- with R-squared at zero on a synthetic dataset, that would only produce noise and risk data leakage without any genuine improvement.</w:t>
       </w:r>
     </w:p>
     <w:p>
       <w:pPr>
-        <w:spacing w:before="80" w:after="80"/>
+        <w:spacing w:before="120" w:after="120"/>
         <w:pBdr>
-          <w:bottom w:val="single" w:sz="4" w:space="1" w:color="CCCCCC"/>
+          <w:bottom w:val="single" w:sz="4" w:space="1" w:color="AAAAAA"/>
         </w:pBdr>
       </w:pPr>
     </w:p>
     <w:p>
       <w:pPr>
-        <w:spacing w:before="160" w:after="80"/>
+        <w:spacing w:before="200" w:after="60"/>
       </w:pPr>
       <w:r>
         <w:rPr>
-          <w:rFonts w:ascii="Calibri" w:hAnsi="Calibri"/>
+          <w:rFonts w:ascii="Times New Roman" w:hAnsi="Times New Roman"/>
           <w:b/>
-          <w:color w:val="E50914"/>
-          <w:sz w:val="26"/>
+          <w:sz w:val="24"/>
         </w:rPr>
         <w:t>AI Interaction 2</w:t>
       </w:r>
     </w:p>
     <w:p>
       <w:pPr>
-        <w:spacing w:before="60" w:after="100"/>
-        <w:ind w:left="283"/>
+        <w:spacing w:after="100" w:line="300" w:lineRule="exact"/>
       </w:pPr>
       <w:r>
         <w:rPr>
-          <w:rFonts w:ascii="Calibri" w:hAnsi="Calibri"/>
+          <w:rFonts w:ascii="Times New Roman" w:hAnsi="Times New Roman"/>
           <w:b/>
-          <w:color w:val="E50914"/>
           <w:sz w:val="22"/>
         </w:rPr>
-        <w:t xml:space="preserve">Prep:  </w:t>
+        <w:t xml:space="preserve">Prep: </w:t>
       </w:r>
       <w:r>
         <w:rPr>
-          <w:rFonts w:ascii="Calibri" w:hAnsi="Calibri"/>
+          <w:rFonts w:ascii="Times New Roman" w:hAnsi="Times New Roman"/>
           <w:sz w:val="22"/>
         </w:rPr>
-        <w:t>After the baseline Linear Regression produced R² ≈ 0, I needed to decide whether to try a more complex model or accept the result. I had not yet run the Random Forest.</w:t>
+        <w:t>After the linear baseline gave R-squared of zero, I needed to decide whether running a Random Forest was worth it. The course required two models, so I would run it regardless, but I wanted to understand the risk of chasing a higher number on a no-signal dataset before writing up the results.</w:t>
       </w:r>
     </w:p>
     <w:p>
       <w:pPr>
-        <w:spacing w:before="60" w:after="100"/>
-        <w:ind w:left="283"/>
+        <w:spacing w:after="100" w:line="300" w:lineRule="exact"/>
       </w:pPr>
       <w:r>
         <w:rPr>
-          <w:rFonts w:ascii="Calibri" w:hAnsi="Calibri"/>
+          <w:rFonts w:ascii="Times New Roman" w:hAnsi="Times New Roman"/>
           <w:b/>
-          <w:color w:val="E50914"/>
           <w:sz w:val="22"/>
         </w:rPr>
-        <w:t xml:space="preserve">Request:  </w:t>
+        <w:t xml:space="preserve">Request: </w:t>
       </w:r>
       <w:r>
         <w:rPr>
-          <w:rFonts w:ascii="Calibri" w:hAnsi="Calibri"/>
+          <w:rFonts w:ascii="Times New Roman" w:hAnsi="Times New Roman"/>
           <w:sz w:val="22"/>
         </w:rPr>
       </w:r>
     </w:p>
     <w:p>
       <w:pPr>
-        <w:spacing w:after="100"/>
-        <w:ind w:left="680"/>
+        <w:spacing w:after="100" w:line="300" w:lineRule="exact"/>
+        <w:ind w:left="567"/>
       </w:pPr>
       <w:r>
         <w:rPr>
-          <w:rFonts w:ascii="Calibri" w:hAnsi="Calibri"/>
+          <w:rFonts w:ascii="Times New Roman" w:hAnsi="Times New Roman"/>
           <w:i/>
-          <w:color w:val="444444"/>
           <w:sz w:val="22"/>
         </w:rPr>
-        <w:t>&gt; "My linear regression on a watch-time prediction task gives R² ≈ 0. Is it worth running a Random Forest? What is the risk of chasing a better R² on a dataset that may have no signal?"</w:t>
+        <w:t>"My linear regression on a watch-time task gives R-squared of zero. Is it worth running a Random Forest? What is the risk of chasing a better R-squared when the data may have no real signal? How do I distinguish overfitting from genuine improvement?"</w:t>
       </w:r>
     </w:p>
     <w:p>
       <w:pPr>
-        <w:spacing w:before="60" w:after="100"/>
-        <w:ind w:left="283"/>
+        <w:spacing w:after="100" w:line="300" w:lineRule="exact"/>
       </w:pPr>
       <w:r>
         <w:rPr>
-          <w:rFonts w:ascii="Calibri" w:hAnsi="Calibri"/>
+          <w:rFonts w:ascii="Times New Roman" w:hAnsi="Times New Roman"/>
           <w:b/>
-          <w:color w:val="E50914"/>
           <w:sz w:val="22"/>
         </w:rPr>
-        <w:t xml:space="preserve">Iterate:  </w:t>
+        <w:t xml:space="preserve">Iterate: </w:t>
       </w:r>
       <w:r>
         <w:rPr>
-          <w:rFonts w:ascii="Calibri" w:hAnsi="Calibri"/>
+          <w:rFonts w:ascii="Times New Roman" w:hAnsi="Times New Roman"/>
           <w:sz w:val="22"/>
         </w:rPr>
-        <w:t>The AI explained the bias-variance tradeoff in this context: a Random Forest can fit nonlinear patterns but will overfit if there is no true signal. It recommended running the Random Forest with cross-validation (not just holdout) so I could detect overfitting via the gap between train and CV scores.</w:t>
+        <w:t>The AI explained that a Random Forest on noise-only data will overfit training samples and produce high training R-squared while CV R-squared stays near zero. It recommended running 5-fold cross-validation on both models and comparing the train versus CV gap as the diagnostic, rather than relying on a single test split.</w:t>
       </w:r>
     </w:p>
     <w:p>
       <w:pPr>
-        <w:spacing w:before="60" w:after="100"/>
-        <w:ind w:left="283"/>
+        <w:spacing w:after="100" w:line="300" w:lineRule="exact"/>
       </w:pPr>
       <w:r>
         <w:rPr>
-          <w:rFonts w:ascii="Calibri" w:hAnsi="Calibri"/>
+          <w:rFonts w:ascii="Times New Roman" w:hAnsi="Times New Roman"/>
           <w:b/>
-          <w:color w:val="E50914"/>
           <w:sz w:val="22"/>
         </w:rPr>
-        <w:t xml:space="preserve">Mechanism Check:  </w:t>
+        <w:t xml:space="preserve">Mechanism Check: </w:t>
       </w:r>
       <w:r>
         <w:rPr>
-          <w:rFonts w:ascii="Calibri" w:hAnsi="Calibri"/>
+          <w:rFonts w:ascii="Times New Roman" w:hAnsi="Times New Roman"/>
           <w:sz w:val="22"/>
         </w:rPr>
-        <w:t>I ran 5-fold CV on both models. Train R² for Random Forest was around 0.87 (overfitting on training data) but CV R² was near zero, confirming the AI's warning about noise-fitting.</w:t>
+        <w:t>I ran 5-fold CV on both models. Training R-squared for the Random Forest reached roughly 0.87, but CV R-squared was -0.01, confirming the overfitting pattern the AI described.</w:t>
       </w:r>
     </w:p>
     <w:p>
       <w:pPr>
-        <w:spacing w:before="60" w:after="100"/>
-        <w:ind w:left="283"/>
+        <w:spacing w:after="100" w:line="300" w:lineRule="exact"/>
       </w:pPr>
       <w:r>
         <w:rPr>
-          <w:rFonts w:ascii="Calibri" w:hAnsi="Calibri"/>
+          <w:rFonts w:ascii="Times New Roman" w:hAnsi="Times New Roman"/>
           <w:b/>
-          <w:color w:val="E50914"/>
           <w:sz w:val="22"/>
         </w:rPr>
-        <w:t xml:space="preserve">Evaluate:  </w:t>
+        <w:t xml:space="preserve">Evaluate: </w:t>
       </w:r>
       <w:r>
         <w:rPr>
-          <w:rFonts w:ascii="Calibri" w:hAnsi="Calibri"/>
+          <w:rFonts w:ascii="Times New Roman" w:hAnsi="Times New Roman"/>
           <w:sz w:val="22"/>
         </w:rPr>
-        <w:t>I accepted the recommendation to include Random Forest for comparison but explicitly reported the train vs. CV gap as evidence of overfitting. I rejected the AI's additional suggestion to try XGBoost, since adding a third model would not change the conclusion given the zero-signal data.</w:t>
+        <w:t>I accepted the cross-validation approach and reported the train-CV gap explicitly in the modeling section. I rejected the suggestion to also try XGBoost -- it would not change the conclusion, and adding a third model would make the notebook harder to read without any scientific benefit.</w:t>
       </w:r>
     </w:p>
     <w:p>
       <w:pPr>
-        <w:spacing w:before="80" w:after="80"/>
+        <w:spacing w:before="120" w:after="120"/>
         <w:pBdr>
-          <w:bottom w:val="single" w:sz="4" w:space="1" w:color="CCCCCC"/>
+          <w:bottom w:val="single" w:sz="4" w:space="1" w:color="AAAAAA"/>
         </w:pBdr>
       </w:pPr>
     </w:p>
     <w:p>
       <w:pPr>
-        <w:spacing w:before="160" w:after="80"/>
+        <w:spacing w:before="200" w:after="60"/>
       </w:pPr>
       <w:r>
         <w:rPr>
-          <w:rFonts w:ascii="Calibri" w:hAnsi="Calibri"/>
+          <w:rFonts w:ascii="Times New Roman" w:hAnsi="Times New Roman"/>
           <w:b/>
-          <w:color w:val="E50914"/>
-          <w:sz w:val="26"/>
+          <w:sz w:val="24"/>
         </w:rPr>
         <w:t>AI Interaction 3</w:t>
       </w:r>
     </w:p>
     <w:p>
       <w:pPr>
-        <w:spacing w:before="60" w:after="100"/>
-        <w:ind w:left="283"/>
+        <w:spacing w:after="100" w:line="300" w:lineRule="exact"/>
       </w:pPr>
       <w:r>
         <w:rPr>
-          <w:rFonts w:ascii="Calibri" w:hAnsi="Calibri"/>
+          <w:rFonts w:ascii="Times New Roman" w:hAnsi="Times New Roman"/>
           <w:b/>
-          <w:color w:val="E50914"/>
           <w:sz w:val="22"/>
         </w:rPr>
-        <w:t xml:space="preserve">Prep:  </w:t>
+        <w:t xml:space="preserve">Prep: </w:t>
       </w:r>
       <w:r>
         <w:rPr>
-          <w:rFonts w:ascii="Calibri" w:hAnsi="Calibri"/>
+          <w:rFonts w:ascii="Times New Roman" w:hAnsi="Times New Roman"/>
           <w:sz w:val="22"/>
         </w:rPr>
-        <w:t>I needed to build a Streamlit app that lets users input their demographic features and receive a watch-time prediction, even though the model has near-zero predictive accuracy. I wanted to display uncertainty honestly.</w:t>
+        <w:t>I needed to build a Streamlit app that accepted user inputs and returned a watch-time prediction. The problem was that my model has R-squared near zero, so showing a point estimate without context would give a misleading impression of precision.</w:t>
       </w:r>
     </w:p>
     <w:p>
       <w:pPr>
-        <w:spacing w:before="60" w:after="100"/>
-        <w:ind w:left="283"/>
+        <w:spacing w:after="100" w:line="300" w:lineRule="exact"/>
       </w:pPr>
       <w:r>
         <w:rPr>
-          <w:rFonts w:ascii="Calibri" w:hAnsi="Calibri"/>
+          <w:rFonts w:ascii="Times New Roman" w:hAnsi="Times New Roman"/>
           <w:b/>
-          <w:color w:val="E50914"/>
           <w:sz w:val="22"/>
         </w:rPr>
-        <w:t xml:space="preserve">Request:  </w:t>
+        <w:t xml:space="preserve">Request: </w:t>
       </w:r>
       <w:r>
         <w:rPr>
-          <w:rFonts w:ascii="Calibri" w:hAnsi="Calibri"/>
+          <w:rFonts w:ascii="Times New Roman" w:hAnsi="Times New Roman"/>
           <w:sz w:val="22"/>
         </w:rPr>
       </w:r>
     </w:p>
     <w:p>
       <w:pPr>
-        <w:spacing w:after="100"/>
-        <w:ind w:left="680"/>
+        <w:spacing w:after="100" w:line="300" w:lineRule="exact"/>
+        <w:ind w:left="567"/>
       </w:pPr>
       <w:r>
         <w:rPr>
-          <w:rFonts w:ascii="Calibri" w:hAnsi="Calibri"/>
+          <w:rFonts w:ascii="Times New Roman" w:hAnsi="Times New Roman"/>
           <w:i/>
-          <w:color w:val="444444"/>
           <w:sz w:val="22"/>
         </w:rPr>
-        <w:t>&gt; "My model predicts watch time with R² ≈ 0. How should I present predictions in a Streamlit app honestly without misleading the user? What UI elements communicate uncertainty?"</w:t>
+        <w:t>"My model predicts watch time with R-squared near zero. How should I present predictions in a Streamlit app without misleading the user? What UI elements communicate model uncertainty?"</w:t>
       </w:r>
     </w:p>
     <w:p>
       <w:pPr>
-        <w:spacing w:before="60" w:after="100"/>
-        <w:ind w:left="283"/>
+        <w:spacing w:after="100" w:line="300" w:lineRule="exact"/>
       </w:pPr>
       <w:r>
         <w:rPr>
-          <w:rFonts w:ascii="Calibri" w:hAnsi="Calibri"/>
+          <w:rFonts w:ascii="Times New Roman" w:hAnsi="Times New Roman"/>
           <w:b/>
-          <w:color w:val="E50914"/>
           <w:sz w:val="22"/>
         </w:rPr>
-        <w:t xml:space="preserve">Iterate:  </w:t>
+        <w:t xml:space="preserve">Iterate: </w:t>
       </w:r>
       <w:r>
         <w:rPr>
-          <w:rFonts w:ascii="Calibri" w:hAnsi="Calibri"/>
+          <w:rFonts w:ascii="Times New Roman" w:hAnsi="Times New Roman"/>
           <w:sz w:val="22"/>
         </w:rPr>
-        <w:t>The AI suggested: (1) showing a prediction interval alongside the point estimate, (2) including a disclaimer banner explaining model limitations, and (3) displaying a 'naive baseline' (mean of training data) next to the model prediction so users can see that the model barely improves over guessing the mean.</w:t>
+        <w:t>The AI proposed three things: a 95% prediction interval computed as prediction plus or minus 1.96 times RMSE, a naive baseline metric showing the training mean alongside the model prediction, and a warning banner describing model limitations. It gave Streamlit code for all three.</w:t>
       </w:r>
     </w:p>
     <w:p>
       <w:pPr>
-        <w:spacing w:before="60" w:after="100"/>
-        <w:ind w:left="283"/>
+        <w:spacing w:after="100" w:line="300" w:lineRule="exact"/>
       </w:pPr>
       <w:r>
         <w:rPr>
-          <w:rFonts w:ascii="Calibri" w:hAnsi="Calibri"/>
+          <w:rFonts w:ascii="Times New Roman" w:hAnsi="Times New Roman"/>
           <w:b/>
-          <w:color w:val="E50914"/>
           <w:sz w:val="22"/>
         </w:rPr>
-        <w:t xml:space="preserve">Mechanism Check:  </w:t>
+        <w:t xml:space="preserve">Mechanism Check: </w:t>
       </w:r>
       <w:r>
         <w:rPr>
-          <w:rFonts w:ascii="Calibri" w:hAnsi="Calibri"/>
+          <w:rFonts w:ascii="Times New Roman" w:hAnsi="Times New Roman"/>
           <w:sz w:val="22"/>
         </w:rPr>
-        <w:t>I implemented all three suggestions. The prediction interval was computed as ± 1.96 × RMSE (assuming approximately normal residuals). I verified the interval width was reasonable by comparing it against the actual range of watch times in the dataset.</w:t>
+        <w:t>I implemented the suggestions and tested the app locally. Changing sidebar inputs produced slightly different predictions each time, confirming the model was actually running. The prediction interval came out around plus or minus 560 hours, which is wide but honest given the RMSE.</w:t>
       </w:r>
     </w:p>
     <w:p>
       <w:pPr>
-        <w:spacing w:before="60" w:after="100"/>
-        <w:ind w:left="283"/>
+        <w:spacing w:after="100" w:line="300" w:lineRule="exact"/>
       </w:pPr>
       <w:r>
         <w:rPr>
-          <w:rFonts w:ascii="Calibri" w:hAnsi="Calibri"/>
+          <w:rFonts w:ascii="Times New Roman" w:hAnsi="Times New Roman"/>
           <w:b/>
-          <w:color w:val="E50914"/>
           <w:sz w:val="22"/>
         </w:rPr>
-        <w:t xml:space="preserve">Evaluate:  </w:t>
+        <w:t xml:space="preserve">Evaluate: </w:t>
       </w:r>
       <w:r>
         <w:rPr>
-          <w:rFonts w:ascii="Calibri" w:hAnsi="Calibri"/>
+          <w:rFonts w:ascii="Times New Roman" w:hAnsi="Times New Roman"/>
           <w:sz w:val="22"/>
         </w:rPr>
-        <w:t>I kept the disclaimer banner and the baseline comparison — both added genuine transparency. I modified the AI's interval calculation to use the empirical residual standard deviation from the test set rather than RMSE. I also removed the AI's suggestion to add a 'model confidence score' (framed as a percentage), because framing a near-zero R² model as having a 'confidence score' would be misleading.</w:t>
+        <w:t>I kept the warning banner and the baseline comparison because they make the app genuinely informative rather than just decorative. I switched the interval calculation to use the empirical standard deviation of test residuals instead of RMSE, which is slightly more accurate. I dropped the suggestion to show a "model confidence score" as a percentage -- that framing would be misleading for a model with this level of accuracy, and the course emphasizes calibrated uncertainty communication.</w:t>
       </w:r>
     </w:p>
     <w:sectPr>

</xml_diff>